<commit_message>
Ajout des modeles, du rapport et de archive_cv1
</commit_message>
<xml_diff>
--- a/rapport/RapportProjetGestionCV.docx
+++ b/rapport/RapportProjetGestionCV.docx
@@ -2,6 +2,7 @@
 <file path=word/document.xml><?xml version="1.0" encoding="utf-8"?>
 <w:document xmlns:wpc="http://schemas.microsoft.com/office/word/2010/wordprocessingCanvas" xmlns:cx="http://schemas.microsoft.com/office/drawing/2014/chartex" xmlns:cx1="http://schemas.microsoft.com/office/drawing/2015/9/8/chartex" xmlns:mc="http://schemas.openxmlformats.org/markup-compatibility/2006" xmlns:o="urn:schemas-microsoft-com:office:office" xmlns:r="http://schemas.openxmlformats.org/officeDocument/2006/relationships" xmlns:m="http://schemas.openxmlformats.org/officeDocument/2006/math" xmlns:v="urn:schemas-microsoft-com:vml" xmlns:wp14="http://schemas.microsoft.com/office/word/2010/wordprocessingDrawing" xmlns:wp="http://schemas.openxmlformats.org/drawingml/2006/wordprocessingDrawing" xmlns:w10="urn:schemas-microsoft-com:office:word" xmlns:w="http://schemas.openxmlformats.org/wordprocessingml/2006/main" xmlns:w14="http://schemas.microsoft.com/office/word/2010/wordml" xmlns:w15="http://schemas.microsoft.com/office/word/2012/wordml" xmlns:w16se="http://schemas.microsoft.com/office/word/2015/wordml/symex" xmlns:wpg="http://schemas.microsoft.com/office/word/2010/wordprocessingGroup" xmlns:wpi="http://schemas.microsoft.com/office/word/2010/wordprocessingInk" xmlns:wne="http://schemas.microsoft.com/office/word/2006/wordml" xmlns:wps="http://schemas.microsoft.com/office/word/2010/wordprocessingShape" mc:Ignorable="w14 w15 w16se wp14">
   <w:body>
+    <w:bookmarkStart w:id="0" w:name="_GoBack"/>
     <w:p>
       <w:pPr>
         <w:pStyle w:val="Titre2"/>
@@ -581,34 +582,22 @@
         </w:rPr>
         <w:t xml:space="preserve">   </w:t>
       </w:r>
-      <w:proofErr w:type="spellStart"/>
       <w:r>
         <w:rPr>
           <w:rFonts w:ascii="Segoe UI Symbol" w:hAnsi="Segoe UI Symbol" w:cs="Segoe UI Symbol"/>
           <w:sz w:val="28"/>
           <w:szCs w:val="28"/>
         </w:rPr>
-        <w:t>Faculte</w:t>
-      </w:r>
-      <w:proofErr w:type="spellEnd"/>
+        <w:t>Faculte des sciences</w:t>
+      </w:r>
       <w:r>
         <w:rPr>
           <w:rFonts w:ascii="Segoe UI Symbol" w:hAnsi="Segoe UI Symbol" w:cs="Segoe UI Symbol"/>
           <w:sz w:val="28"/>
           <w:szCs w:val="28"/>
         </w:rPr>
-        <w:t xml:space="preserve"> des sciences</w:t>
-      </w:r>
-      <w:r>
-        <w:rPr>
-          <w:rFonts w:ascii="Segoe UI Symbol" w:hAnsi="Segoe UI Symbol" w:cs="Segoe UI Symbol"/>
-          <w:sz w:val="28"/>
-          <w:szCs w:val="28"/>
-        </w:rPr>
         <w:tab/>
       </w:r>
-      <w:bookmarkStart w:id="0" w:name="_GoBack"/>
-      <w:bookmarkEnd w:id="0"/>
     </w:p>
     <w:p>
       <w:pPr>
@@ -694,25 +683,7 @@
           <w:sz w:val="28"/>
           <w:szCs w:val="28"/>
         </w:rPr>
-        <w:t xml:space="preserve">                                   </w:t>
-      </w:r>
-      <w:proofErr w:type="spellStart"/>
-      <w:r>
-        <w:rPr>
-          <w:rFonts w:ascii="Segoe UI Symbol" w:hAnsi="Segoe UI Symbol" w:cs="Segoe UI Symbol"/>
-          <w:sz w:val="28"/>
-          <w:szCs w:val="28"/>
-        </w:rPr>
-        <w:t>Departement</w:t>
-      </w:r>
-      <w:proofErr w:type="spellEnd"/>
-      <w:r>
-        <w:rPr>
-          <w:rFonts w:ascii="Segoe UI Symbol" w:hAnsi="Segoe UI Symbol" w:cs="Segoe UI Symbol"/>
-          <w:sz w:val="28"/>
-          <w:szCs w:val="28"/>
-        </w:rPr>
-        <w:t xml:space="preserve"> MATHS INFO</w:t>
+        <w:t xml:space="preserve">                                   Departement MATHS INFO</w:t>
       </w:r>
       <w:r>
         <w:rPr>
@@ -822,19 +793,8 @@
                                 <w:szCs w:val="36"/>
                                 <w:lang w:val="fr-FR"/>
                               </w:rPr>
-                              <w:t xml:space="preserve"> Application de choix de cv </w:t>
+                              <w:t xml:space="preserve"> Application de choix de cv par  l’IA</w:t>
                             </w:r>
-                            <w:proofErr w:type="gramStart"/>
-                            <w:r>
-                              <w:rPr>
-                                <w:color w:val="000000" w:themeColor="text1"/>
-                                <w:sz w:val="40"/>
-                                <w:szCs w:val="36"/>
-                                <w:lang w:val="fr-FR"/>
-                              </w:rPr>
-                              <w:t>par  l’IA</w:t>
-                            </w:r>
-                            <w:proofErr w:type="gramEnd"/>
                           </w:p>
                           <w:p>
                             <w:pPr>
@@ -946,19 +906,8 @@
                           <w:szCs w:val="36"/>
                           <w:lang w:val="fr-FR"/>
                         </w:rPr>
-                        <w:t xml:space="preserve"> Application de choix de cv </w:t>
+                        <w:t xml:space="preserve"> Application de choix de cv par  l’IA</w:t>
                       </w:r>
-                      <w:proofErr w:type="gramStart"/>
-                      <w:r>
-                        <w:rPr>
-                          <w:color w:val="000000" w:themeColor="text1"/>
-                          <w:sz w:val="40"/>
-                          <w:szCs w:val="36"/>
-                          <w:lang w:val="fr-FR"/>
-                        </w:rPr>
-                        <w:t>par  l’IA</w:t>
-                      </w:r>
-                      <w:proofErr w:type="gramEnd"/>
                     </w:p>
                     <w:p>
                       <w:pPr>
@@ -1030,9 +979,13 @@
           <w:sz w:val="27"/>
           <w:szCs w:val="27"/>
         </w:rPr>
-        <w:t xml:space="preserve">         </w:t>
-      </w:r>
-      <w:r>
+        <w:t xml:space="preserve">        </w:t>
+      </w:r>
+    </w:p>
+    <w:p>
+      <w:pPr>
+        <w:spacing w:before="100" w:beforeAutospacing="1" w:after="100" w:afterAutospacing="1" w:line="240" w:lineRule="auto"/>
+        <w:outlineLvl w:val="2"/>
         <w:rPr>
           <w:rFonts w:ascii="Times New Roman" w:eastAsia="Times New Roman" w:hAnsi="Times New Roman" w:cs="Times New Roman"/>
           <w:b/>
@@ -1040,10 +993,12 @@
           <w:sz w:val="27"/>
           <w:szCs w:val="27"/>
         </w:rPr>
-        <w:t xml:space="preserve">AI-CV </w:t>
-      </w:r>
-      <w:proofErr w:type="spellStart"/>
-      <w:r>
+      </w:pPr>
+    </w:p>
+    <w:p>
+      <w:pPr>
+        <w:spacing w:before="100" w:beforeAutospacing="1" w:after="100" w:afterAutospacing="1" w:line="240" w:lineRule="auto"/>
+        <w:outlineLvl w:val="2"/>
         <w:rPr>
           <w:rFonts w:ascii="Times New Roman" w:eastAsia="Times New Roman" w:hAnsi="Times New Roman" w:cs="Times New Roman"/>
           <w:b/>
@@ -1051,9 +1006,7 @@
           <w:sz w:val="27"/>
           <w:szCs w:val="27"/>
         </w:rPr>
-        <w:t>Selector</w:t>
-      </w:r>
-      <w:proofErr w:type="spellEnd"/>
+      </w:pPr>
       <w:r>
         <w:rPr>
           <w:rFonts w:ascii="Times New Roman" w:eastAsia="Times New Roman" w:hAnsi="Times New Roman" w:cs="Times New Roman"/>
@@ -1062,7 +1015,7 @@
           <w:sz w:val="27"/>
           <w:szCs w:val="27"/>
         </w:rPr>
-        <w:t xml:space="preserve"> - Sél</w:t>
+        <w:t>AI-CV Selector - Sél</w:t>
       </w:r>
       <w:r>
         <w:rPr>
@@ -2039,6 +1992,7 @@
         <w:tab/>
       </w:r>
     </w:p>
+    <w:bookmarkEnd w:id="0"/>
     <w:p>
       <w:pPr>
         <w:tabs>
@@ -2062,6 +2016,7 @@
           <w:sz w:val="36"/>
           <w:szCs w:val="36"/>
         </w:rPr>
+        <w:lastRenderedPageBreak/>
         <w:tab/>
       </w:r>
     </w:p>
@@ -2111,7 +2066,6 @@
           <w:sz w:val="36"/>
           <w:szCs w:val="36"/>
         </w:rPr>
-        <w:lastRenderedPageBreak/>
         <w:t>TABLE DES MATIÈRES</w:t>
       </w:r>
     </w:p>
@@ -2874,6 +2828,7 @@
           <w:sz w:val="24"/>
           <w:szCs w:val="24"/>
         </w:rPr>
+        <w:lastRenderedPageBreak/>
         <w:t>Dans un environnement économique hautement compétitif, le recrutement constitue un enjeu stratégique majeur pour les entreprises. Les départements de ressources humaines font face à un volume croissant de candidatures, rendant le processus de sélection chronophage et sujet à des biais humains involontaires.</w:t>
       </w:r>
     </w:p>
@@ -2897,7 +2852,6 @@
           <w:sz w:val="27"/>
           <w:szCs w:val="27"/>
         </w:rPr>
-        <w:lastRenderedPageBreak/>
         <w:t>2.2 Problématique</w:t>
       </w:r>
     </w:p>
@@ -3678,6 +3632,7 @@
           <w:sz w:val="24"/>
           <w:szCs w:val="24"/>
         </w:rPr>
+        <w:lastRenderedPageBreak/>
         <w:t xml:space="preserve">Garantir une </w:t>
       </w:r>
       <w:r>
@@ -3781,7 +3736,6 @@
           <w:sz w:val="24"/>
           <w:szCs w:val="24"/>
         </w:rPr>
-        <w:lastRenderedPageBreak/>
         <w:t xml:space="preserve">Traitement d'un CV en </w:t>
       </w:r>
       <w:r>
@@ -5050,6 +5004,7 @@
           <w:sz w:val="24"/>
           <w:szCs w:val="24"/>
         </w:rPr>
+        <w:lastRenderedPageBreak/>
         <w:t>Langage :</w:t>
       </w:r>
       <w:r>
@@ -5168,7 +5123,6 @@
           <w:sz w:val="24"/>
           <w:szCs w:val="24"/>
         </w:rPr>
-        <w:lastRenderedPageBreak/>
         <w:t>pandas (manipulation de données)</w:t>
       </w:r>
     </w:p>
@@ -6764,6 +6718,7 @@
           <w:szCs w:val="20"/>
           <w:lang w:val="en-US"/>
         </w:rPr>
+        <w:lastRenderedPageBreak/>
         <w:t xml:space="preserve">  score_total FLOAT,</w:t>
       </w:r>
     </w:p>
@@ -6955,7 +6910,6 @@
           <w:sz w:val="20"/>
           <w:szCs w:val="20"/>
         </w:rPr>
-        <w:lastRenderedPageBreak/>
         <w:t xml:space="preserve">  categorie_predite VARCHAR(100),</w:t>
       </w:r>
     </w:p>
@@ -7713,6 +7667,7 @@
           <w:sz w:val="24"/>
           <w:szCs w:val="24"/>
         </w:rPr>
+        <w:lastRenderedPageBreak/>
         <w:t>✅</w:t>
       </w:r>
       <w:r>
@@ -7790,7 +7745,6 @@
                 <w:sz w:val="24"/>
                 <w:szCs w:val="24"/>
               </w:rPr>
-              <w:lastRenderedPageBreak/>
               <w:t>Critère</w:t>
             </w:r>
           </w:p>
@@ -8859,6 +8813,7 @@
           <w:sz w:val="24"/>
           <w:szCs w:val="24"/>
         </w:rPr>
+        <w:lastRenderedPageBreak/>
         <w:t>Phase 1 : Étude et conception (2 semaines)</w:t>
       </w:r>
     </w:p>
@@ -8881,7 +8836,6 @@
           <w:sz w:val="24"/>
           <w:szCs w:val="24"/>
         </w:rPr>
-        <w:lastRenderedPageBreak/>
         <w:t>Analyse des besoins</w:t>
       </w:r>
     </w:p>
@@ -9652,6 +9606,7 @@
           <w:sz w:val="24"/>
           <w:szCs w:val="24"/>
         </w:rPr>
+        <w:lastRenderedPageBreak/>
         <w:t>✅</w:t>
       </w:r>
       <w:r>
@@ -9682,7 +9637,6 @@
           <w:sz w:val="24"/>
           <w:szCs w:val="24"/>
         </w:rPr>
-        <w:lastRenderedPageBreak/>
         <w:t>✅</w:t>
       </w:r>
       <w:r>
@@ -10833,6 +10787,7 @@
           <w:sz w:val="20"/>
           <w:szCs w:val="20"/>
         </w:rPr>
+        <w:lastRenderedPageBreak/>
         <w:t># Recherche de patterns "X ans d'expérience"</w:t>
       </w:r>
     </w:p>
@@ -10871,7 +10826,6 @@
           <w:szCs w:val="20"/>
           <w:lang w:val="en-US"/>
         </w:rPr>
-        <w:lastRenderedPageBreak/>
         <w:t>pattern = r"(\d+)\s+(ans|années)"</w:t>
       </w:r>
     </w:p>
@@ -12293,6 +12247,7 @@
                 <w:sz w:val="24"/>
                 <w:szCs w:val="24"/>
               </w:rPr>
+              <w:lastRenderedPageBreak/>
               <w:t>Compétence</w:t>
             </w:r>
           </w:p>
@@ -12467,7 +12422,6 @@
                 <w:sz w:val="24"/>
                 <w:szCs w:val="24"/>
               </w:rPr>
-              <w:lastRenderedPageBreak/>
               <w:t>Management</w:t>
             </w:r>
           </w:p>
@@ -14212,6 +14166,7 @@
           <w:sz w:val="36"/>
           <w:szCs w:val="36"/>
         </w:rPr>
+        <w:lastRenderedPageBreak/>
         <w:t>8. ANALYSE DES DONNÉES</w:t>
       </w:r>
     </w:p>
@@ -14235,7 +14190,6 @@
           <w:sz w:val="27"/>
           <w:szCs w:val="27"/>
         </w:rPr>
-        <w:lastRenderedPageBreak/>
         <w:t>8.1 Insights sur le marché de l'emploi</w:t>
       </w:r>
     </w:p>
@@ -14866,6 +14820,7 @@
           <w:sz w:val="24"/>
           <w:szCs w:val="24"/>
         </w:rPr>
+        <w:lastRenderedPageBreak/>
         <w:t>Solution implémentée :</w:t>
       </w:r>
     </w:p>
@@ -14888,7 +14843,6 @@
           <w:sz w:val="24"/>
           <w:szCs w:val="24"/>
         </w:rPr>
-        <w:lastRenderedPageBreak/>
         <w:t xml:space="preserve">Utilisation de </w:t>
       </w:r>
       <w:r>
@@ -15681,6 +15635,7 @@
           <w:sz w:val="24"/>
           <w:szCs w:val="24"/>
         </w:rPr>
+        <w:lastRenderedPageBreak/>
         <w:t>Problème :</w:t>
       </w:r>
       <w:r>
@@ -15709,7 +15664,6 @@
           <w:sz w:val="24"/>
           <w:szCs w:val="24"/>
         </w:rPr>
-        <w:lastRenderedPageBreak/>
         <w:t>Solution implémentée :</w:t>
       </w:r>
     </w:p>
@@ -16437,6 +16391,7 @@
           <w:sz w:val="24"/>
           <w:szCs w:val="24"/>
         </w:rPr>
+        <w:lastRenderedPageBreak/>
         <w:t>HTTPS obligatoire (certificat SSL/TLS)</w:t>
       </w:r>
     </w:p>
@@ -16481,7 +16436,6 @@
           <w:sz w:val="24"/>
           <w:szCs w:val="24"/>
         </w:rPr>
-        <w:lastRenderedPageBreak/>
         <w:t>Rate limiting sur l'API (100 req/min)</w:t>
       </w:r>
     </w:p>
@@ -17311,6 +17265,7 @@
           <w:sz w:val="24"/>
           <w:szCs w:val="24"/>
         </w:rPr>
+        <w:lastRenderedPageBreak/>
         <w:t xml:space="preserve"> </w:t>
       </w:r>
       <w:r>
@@ -17389,7 +17344,6 @@
           <w:sz w:val="24"/>
           <w:szCs w:val="24"/>
         </w:rPr>
-        <w:lastRenderedPageBreak/>
         <w:t>Pour les candidats :</w:t>
       </w:r>
     </w:p>
@@ -18166,6 +18120,7 @@
           <w:sz w:val="24"/>
           <w:szCs w:val="24"/>
         </w:rPr>
+        <w:lastRenderedPageBreak/>
         <w:t>Perspectives professionnelles :</w:t>
       </w:r>
       <w:r>
@@ -18210,7 +18165,6 @@
           <w:sz w:val="24"/>
           <w:szCs w:val="24"/>
         </w:rPr>
-        <w:lastRenderedPageBreak/>
         <w:pict>
           <v:rect id="_x0000_i1036" style="width:0;height:1.5pt" o:hralign="center" o:hrstd="t" o:hr="t" fillcolor="#a0a0a0" stroked="f"/>
         </w:pict>
@@ -18978,6 +18932,7 @@
           <w:sz w:val="24"/>
           <w:szCs w:val="24"/>
         </w:rPr>
+        <w:lastRenderedPageBreak/>
         <w:t xml:space="preserve"> Benchmarking des candidats</w:t>
       </w:r>
     </w:p>
@@ -19023,7 +18978,6 @@
           <w:sz w:val="27"/>
           <w:szCs w:val="27"/>
         </w:rPr>
-        <w:lastRenderedPageBreak/>
         <w:t>12.3 Vision à long terme</w:t>
       </w:r>
     </w:p>
@@ -19773,6 +19727,7 @@
           <w:sz w:val="24"/>
           <w:szCs w:val="24"/>
         </w:rPr>
+        <w:lastRenderedPageBreak/>
         <w:t>Maintenance technique</w:t>
       </w:r>
     </w:p>
@@ -19839,7 +19794,6 @@
           <w:sz w:val="24"/>
           <w:szCs w:val="24"/>
         </w:rPr>
-        <w:lastRenderedPageBreak/>
         <w:t>Tests automatisés (CI/CD)</w:t>
       </w:r>
     </w:p>
@@ -20521,6 +20475,7 @@
           <w:sz w:val="24"/>
           <w:szCs w:val="24"/>
         </w:rPr>
+        <w:lastRenderedPageBreak/>
         <w:t>Axios 1.4.0</w:t>
       </w:r>
     </w:p>
@@ -20566,7 +20521,6 @@
           <w:sz w:val="27"/>
           <w:szCs w:val="27"/>
         </w:rPr>
-        <w:lastRenderedPageBreak/>
         <w:t>Annexe C : Contacts et support</w:t>
       </w:r>
     </w:p>
@@ -21780,7 +21734,6 @@
         <w:docPartUnique/>
       </w:docPartObj>
     </w:sdtPr>
-    <w:sdtEndPr/>
     <w:sdtContent>
       <w:p>
         <w:pPr>
@@ -21801,7 +21754,7 @@
             <w:noProof/>
             <w:lang w:val="fr-FR"/>
           </w:rPr>
-          <w:t>5</w:t>
+          <w:t>10</w:t>
         </w:r>
         <w:r>
           <w:fldChar w:fldCharType="end"/>
@@ -21827,7 +21780,6 @@
         <w:docPartUnique/>
       </w:docPartObj>
     </w:sdtPr>
-    <w:sdtEndPr/>
     <w:sdtContent>
       <w:p>
         <w:pPr>
@@ -34203,7 +34155,7 @@
 </file>
 
 <file path=customXml/itemProps1.xml><?xml version="1.0" encoding="utf-8"?>
-<ds:datastoreItem xmlns:ds="http://schemas.openxmlformats.org/officeDocument/2006/customXml" ds:itemID="{4297E9BE-EB2F-4DFC-ABF4-4BF865B00B3A}">
+<ds:datastoreItem xmlns:ds="http://schemas.openxmlformats.org/officeDocument/2006/customXml" ds:itemID="{9C6B68A0-2DAC-4ADE-AF39-2F810E47EAAA}">
   <ds:schemaRefs>
     <ds:schemaRef ds:uri="http://schemas.openxmlformats.org/officeDocument/2006/bibliography"/>
   </ds:schemaRefs>

</xml_diff>